<commit_message>
docs(release): Synchronize 0.2.0-alpha.1 guides and download kits
</commit_message>
<xml_diff>
--- a/site/downloads/bruno/assets/nuaforma-example-template.docx
+++ b/site/downloads/bruno/assets/nuaforma-example-template.docx
@@ -685,6 +685,34 @@
         </w:drawing>
       </w:r>
     </w:p>
+    <w:p>
+      <w:r>
+        <w:t>{#if (image ?? null) != null}</w:t>
+      </w:r>
+    </w:p>
+    <w:p>
+      <w:pPr>
+        <w:pStyle w:val="Heading1"/>
+      </w:pPr>
+      <w:r>
+        <w:t>Supplied illustration</w:t>
+      </w:r>
+    </w:p>
+    <w:p>
+      <w:r>
+        <w:t>The image below comes from the JSON data and fits within 60 by 25 millimetres without changing its aspect ratio.</w:t>
+      </w:r>
+    </w:p>
+    <w:p>
+      <w:r>
+        <w:t>{image | image(60, 25, true)}</w:t>
+      </w:r>
+    </w:p>
+    <w:p>
+      <w:r>
+        <w:t>{/if}</w:t>
+      </w:r>
+    </w:p>
     <w:sectPr>
       <w:headerReference w:type="default" r:id="rId1"/>
       <w:footerReference w:type="default" r:id="rId9"/>

</xml_diff>